<commit_message>
fix figure captions (put below the figure)
</commit_message>
<xml_diff>
--- a/input/ISO_21214.docx
+++ b/input/ISO_21214.docx
@@ -2026,7 +2026,7 @@
     <w:tbl>
       <w:tblPr>
         <w:tblStyle w:val="a7"/>
-        <w:tblW w:w="9067" w:type="dxa"/>
+        <w:tblW w:w="9634" w:type="dxa"/>
         <w:tblInd w:w="0" w:type="dxa"/>
         <w:tblBorders>
           <w:top w:val="single" w:sz="4" w:space="0" w:color="000000"/>
@@ -2040,13 +2040,15 @@
         <w:tblLook w:val="0400" w:firstRow="0" w:lastRow="0" w:firstColumn="0" w:lastColumn="0" w:noHBand="0" w:noVBand="1"/>
       </w:tblPr>
       <w:tblGrid>
-        <w:gridCol w:w="4606"/>
-        <w:gridCol w:w="4461"/>
+        <w:gridCol w:w="5240"/>
+        <w:gridCol w:w="2126"/>
+        <w:gridCol w:w="2268"/>
       </w:tblGrid>
       <w:tr>
         <w:tc>
           <w:tcPr>
-            <w:tcW w:w="4606" w:type="dxa"/>
+            <w:tcW w:w="5240" w:type="dxa"/>
+            <w:vMerge w:val="restart"/>
           </w:tcPr>
           <w:p>
             <w:pPr>
@@ -2056,45 +2058,26 @@
                 <w:lang w:val="en-GB"/>
               </w:rPr>
             </w:pPr>
+            <w:bookmarkStart w:id="7" w:name="_Hlk232378733"/>
             <w:r>
               <w:rPr>
                 <w:b/>
                 <w:lang w:val="en-GB"/>
               </w:rPr>
-              <w:t>Paramet</w:t>
-            </w:r>
-            <w:r>
-              <w:rPr>
-                <w:b/>
-                <w:lang w:val="en-GB"/>
-              </w:rPr>
-              <w:t>e</w:t>
-            </w:r>
-            <w:r>
-              <w:rPr>
-                <w:b/>
-                <w:lang w:val="en-GB"/>
-              </w:rPr>
-              <w:t>r</w:t>
-            </w:r>
-            <w:r>
-              <w:rPr>
-                <w:b/>
-                <w:lang w:val="en-GB"/>
-              </w:rPr>
-              <w:tab/>
-              <w:t xml:space="preserve">                                                                  </w:t>
+              <w:t>Parameter</w:t>
             </w:r>
           </w:p>
         </w:tc>
         <w:tc>
           <w:tcPr>
-            <w:tcW w:w="4461" w:type="dxa"/>
+            <w:tcW w:w="4394" w:type="dxa"/>
+            <w:gridSpan w:val="2"/>
           </w:tcPr>
           <w:p>
             <w:pPr>
               <w:spacing w:before="60"/>
               <w:rPr>
+                <w:b/>
                 <w:lang w:val="en-GB"/>
               </w:rPr>
             </w:pPr>
@@ -2103,103 +2086,7 @@
                 <w:b/>
                 <w:lang w:val="en-GB"/>
               </w:rPr>
-              <w:t xml:space="preserve">                         </w:t>
-            </w:r>
-            <w:r>
-              <w:rPr>
-                <w:b/>
-                <w:lang w:val="en-GB"/>
-              </w:rPr>
               <w:t>Specification</w:t>
-            </w:r>
-            <w:r>
-              <w:rPr>
-                <w:b/>
-                <w:lang w:val="en-GB"/>
-              </w:rPr>
-              <w:t xml:space="preserve">    </w:t>
-            </w:r>
-            <w:r>
-              <w:rPr>
-                <w:lang w:val="en-GB"/>
-              </w:rPr>
-              <w:t xml:space="preserve">     </w:t>
-            </w:r>
-          </w:p>
-          <w:p>
-            <w:pPr>
-              <w:spacing w:before="60"/>
-              <w:rPr>
-                <w:lang w:val="en-GB"/>
-              </w:rPr>
-            </w:pPr>
-            <w:r>
-              <w:rPr>
-                <w:lang w:val="en-GB"/>
-              </w:rPr>
-              <w:t xml:space="preserve">     </w:t>
-            </w:r>
-            <w:r>
-              <w:rPr>
-                <w:lang w:val="en-GB"/>
-              </w:rPr>
-              <w:t>Channel</w:t>
-            </w:r>
-            <w:r>
-              <w:rPr>
-                <w:lang w:val="en-GB"/>
-              </w:rPr>
-              <w:t xml:space="preserve"> 870                  </w:t>
-            </w:r>
-            <w:r>
-              <w:rPr>
-                <w:lang w:val="en-GB"/>
-              </w:rPr>
-              <w:t xml:space="preserve">Channel </w:t>
-            </w:r>
-            <w:r>
-              <w:rPr>
-                <w:lang w:val="en-GB"/>
-              </w:rPr>
-              <w:t>970</w:t>
-            </w:r>
-          </w:p>
-          <w:p>
-            <w:pPr>
-              <w:spacing w:before="60"/>
-              <w:rPr>
-                <w:lang w:val="en-GB"/>
-              </w:rPr>
-            </w:pPr>
-            <w:r>
-              <w:rPr>
-                <w:lang w:val="en-GB"/>
-              </w:rPr>
-              <w:t>(</w:t>
-            </w:r>
-            <w:r>
-              <w:rPr>
-                <w:lang w:val="en-GB"/>
-              </w:rPr>
-              <w:t>main channel</w:t>
-            </w:r>
-            <w:r>
-              <w:rPr>
-                <w:lang w:val="en-GB"/>
-              </w:rPr>
-              <w:t>)           (</w:t>
-            </w:r>
-            <w:r>
-              <w:rPr>
-                <w:lang w:val="en-GB"/>
-              </w:rPr>
-              <w:t>alternative channel</w:t>
-            </w:r>
-            <w:r>
-              <w:rPr>
-                <w:lang w:val="en-GB"/>
-              </w:rPr>
-              <w:t>)</w:t>
             </w:r>
           </w:p>
         </w:tc>
@@ -2207,33 +2094,62 @@
       <w:tr>
         <w:tc>
           <w:tcPr>
-            <w:tcW w:w="4606" w:type="dxa"/>
+            <w:tcW w:w="5240" w:type="dxa"/>
+            <w:vMerge/>
           </w:tcPr>
           <w:p>
             <w:pPr>
               <w:spacing w:before="60"/>
               <w:rPr>
+                <w:b/>
+                <w:lang w:val="en-GB"/>
+              </w:rPr>
+            </w:pPr>
+          </w:p>
+        </w:tc>
+        <w:tc>
+          <w:tcPr>
+            <w:tcW w:w="2126" w:type="dxa"/>
+          </w:tcPr>
+          <w:p>
+            <w:pPr>
+              <w:spacing w:before="60"/>
+              <w:rPr>
                 <w:lang w:val="en-GB"/>
               </w:rPr>
             </w:pPr>
             <w:r>
               <w:rPr>
-                <w:i/>
-                <w:lang w:val="en-GB"/>
-              </w:rPr>
-              <w:t>TX1</w:t>
+                <w:lang w:val="en-GB"/>
+              </w:rPr>
+              <w:t>Channel 870</w:t>
+            </w:r>
+          </w:p>
+          <w:p>
+            <w:pPr>
+              <w:spacing w:before="60"/>
+              <w:rPr>
+                <w:b/>
+                <w:lang w:val="en-GB"/>
+              </w:rPr>
+            </w:pPr>
+            <w:r>
+              <w:rPr>
+                <w:lang w:val="en-GB"/>
+              </w:rPr>
+              <w:t>(main channel</w:t>
             </w:r>
             <w:r>
               <w:rPr>
                 <w:lang w:val="en-GB"/>
               </w:rPr>
-              <w:t xml:space="preserve"> Nominal transmitter wavelength</w:t>
+              <w:t>)</w:t>
             </w:r>
           </w:p>
         </w:tc>
         <w:tc>
           <w:tcPr>
-            <w:tcW w:w="4461" w:type="dxa"/>
+            <w:tcW w:w="2268" w:type="dxa"/>
           </w:tcPr>
           <w:p>
             <w:pPr>
@@ -2246,20 +2162,22 @@
               <w:rPr>
                 <w:lang w:val="en-GB"/>
               </w:rPr>
-              <w:t xml:space="preserve">     870 nm </w:t>
+              <w:t>Channel 970</w:t>
             </w:r>
+          </w:p>
+          <w:p>
+            <w:pPr>
+              <w:spacing w:before="60"/>
+              <w:rPr>
+                <w:b/>
+                <w:lang w:val="en-GB"/>
+              </w:rPr>
+            </w:pPr>
             <w:r>
               <w:rPr>
                 <w:lang w:val="en-GB"/>
               </w:rPr>
-              <w:tab/>
-            </w:r>
-            <w:r>
-              <w:rPr>
-                <w:lang w:val="en-GB"/>
-              </w:rPr>
-              <w:tab/>
-              <w:t xml:space="preserve">    970 nm</w:t>
+              <w:t>(alternative channel)</w:t>
             </w:r>
           </w:p>
         </w:tc>
@@ -2267,7 +2185,7 @@
       <w:tr>
         <w:tc>
           <w:tcPr>
-            <w:tcW w:w="4606" w:type="dxa"/>
+            <w:tcW w:w="5240" w:type="dxa"/>
           </w:tcPr>
           <w:p>
             <w:pPr>
@@ -2281,37 +2199,19 @@
                 <w:i/>
                 <w:lang w:val="en-GB"/>
               </w:rPr>
-              <w:t xml:space="preserve">TX2 </w:t>
+              <w:t>TX1</w:t>
             </w:r>
             <w:r>
               <w:rPr>
                 <w:lang w:val="en-GB"/>
               </w:rPr>
-              <w:t>Transmitter pass band</w:t>
-            </w:r>
-            <w:r>
-              <w:rPr>
-                <w:lang w:val="en-GB"/>
-              </w:rPr>
-              <w:tab/>
-            </w:r>
-            <w:r>
-              <w:rPr>
-                <w:lang w:val="en-GB"/>
-              </w:rPr>
-              <w:tab/>
-            </w:r>
-            <w:r>
-              <w:rPr>
-                <w:lang w:val="en-GB"/>
-              </w:rPr>
-              <w:tab/>
+              <w:t xml:space="preserve"> Nominal transmitter wavelength</w:t>
             </w:r>
           </w:p>
         </w:tc>
         <w:tc>
           <w:tcPr>
-            <w:tcW w:w="4461" w:type="dxa"/>
+            <w:tcW w:w="2126" w:type="dxa"/>
           </w:tcPr>
           <w:p>
             <w:pPr>
@@ -2324,26 +2224,26 @@
               <w:rPr>
                 <w:lang w:val="en-GB"/>
               </w:rPr>
-              <w:t xml:space="preserve"> </w:t>
+              <w:t>870 nm</w:t>
             </w:r>
+          </w:p>
+        </w:tc>
+        <w:tc>
+          <w:tcPr>
+            <w:tcW w:w="2268" w:type="dxa"/>
+          </w:tcPr>
+          <w:p>
+            <w:pPr>
+              <w:spacing w:before="60"/>
+              <w:rPr>
+                <w:lang w:val="en-GB"/>
+              </w:rPr>
+            </w:pPr>
             <w:r>
               <w:rPr>
                 <w:lang w:val="en-GB"/>
               </w:rPr>
-              <w:t xml:space="preserve"> 820 nm to 910 nm </w:t>
-            </w:r>
-            <w:r>
-              <w:rPr>
-                <w:lang w:val="en-GB"/>
-              </w:rPr>
-              <w:tab/>
-              <w:t>920 nm to</w:t>
-            </w:r>
-            <w:r>
-              <w:rPr>
-                <w:lang w:val="en-GB"/>
-              </w:rPr>
-              <w:t xml:space="preserve"> 1 010 nm</w:t>
+              <w:t>970 nm</w:t>
             </w:r>
           </w:p>
         </w:tc>
@@ -2351,7 +2251,7 @@
       <w:tr>
         <w:tc>
           <w:tcPr>
-            <w:tcW w:w="4606" w:type="dxa"/>
+            <w:tcW w:w="5240" w:type="dxa"/>
           </w:tcPr>
           <w:p>
             <w:pPr>
@@ -2365,44 +2265,92 @@
                 <w:i/>
                 <w:lang w:val="en-GB"/>
               </w:rPr>
-              <w:t xml:space="preserve">TX3 </w:t>
+              <w:t xml:space="preserve">TX2 </w:t>
             </w:r>
             <w:r>
               <w:rPr>
                 <w:lang w:val="en-GB"/>
               </w:rPr>
-              <w:t>Coherence length</w:t>
-            </w:r>
-            <w:r>
-              <w:rPr>
-                <w:lang w:val="en-GB"/>
-              </w:rPr>
-              <w:t xml:space="preserve"> </w:t>
-            </w:r>
-            <w:r>
-              <w:rPr>
-                <w:lang w:val="en-GB"/>
-              </w:rPr>
-              <w:tab/>
-            </w:r>
-            <w:r>
-              <w:rPr>
-                <w:lang w:val="en-GB"/>
-              </w:rPr>
-              <w:tab/>
+              <w:t>Transmitter pass band</w:t>
             </w:r>
           </w:p>
         </w:tc>
         <w:tc>
           <w:tcPr>
-            <w:tcW w:w="4461" w:type="dxa"/>
+            <w:tcW w:w="2126" w:type="dxa"/>
+          </w:tcPr>
+          <w:p>
+            <w:pPr>
+              <w:spacing w:before="60"/>
+              <w:rPr>
+                <w:lang w:val="en-GB"/>
+              </w:rPr>
+            </w:pPr>
+            <w:r>
+              <w:rPr>
+                <w:lang w:val="en-GB"/>
+              </w:rPr>
+              <w:t>820 nm to 910 nm</w:t>
+            </w:r>
+          </w:p>
+        </w:tc>
+        <w:tc>
+          <w:tcPr>
+            <w:tcW w:w="2268" w:type="dxa"/>
+          </w:tcPr>
+          <w:p>
+            <w:pPr>
+              <w:spacing w:before="60"/>
+              <w:rPr>
+                <w:lang w:val="en-GB"/>
+              </w:rPr>
+            </w:pPr>
+            <w:r>
+              <w:rPr>
+                <w:lang w:val="en-GB"/>
+              </w:rPr>
+              <w:t>920 nm to 1 010 nm</w:t>
+            </w:r>
+          </w:p>
+        </w:tc>
+      </w:tr>
+      <w:tr>
+        <w:tc>
+          <w:tcPr>
+            <w:tcW w:w="5240" w:type="dxa"/>
+          </w:tcPr>
+          <w:p>
+            <w:pPr>
+              <w:spacing w:before="60"/>
+              <w:rPr>
+                <w:lang w:val="en-GB"/>
+              </w:rPr>
+            </w:pPr>
+            <w:r>
+              <w:rPr>
+                <w:i/>
+                <w:lang w:val="en-GB"/>
+              </w:rPr>
+              <w:t xml:space="preserve">TX3 </w:t>
+            </w:r>
+            <w:r>
+              <w:rPr>
+                <w:lang w:val="en-GB"/>
+              </w:rPr>
+              <w:t>Coherence length</w:t>
+            </w:r>
+          </w:p>
+        </w:tc>
+        <w:tc>
+          <w:tcPr>
+            <w:tcW w:w="4394" w:type="dxa"/>
+            <w:gridSpan w:val="2"/>
           </w:tcPr>
           <w:p>
             <w:pPr>
               <w:spacing w:before="60"/>
               <w:jc w:val="center"/>
               <w:rPr>
-                <w:i/>
                 <w:lang w:val="en-GB"/>
               </w:rPr>
             </w:pPr>
@@ -2418,7 +2366,7 @@
       <w:tr>
         <w:tc>
           <w:tcPr>
-            <w:tcW w:w="4606" w:type="dxa"/>
+            <w:tcW w:w="5240" w:type="dxa"/>
           </w:tcPr>
           <w:p>
             <w:pPr>
@@ -2439,43 +2387,19 @@
                 <w:lang w:val="en-GB"/>
               </w:rPr>
               <w:t>Total radiated power</w:t>
-            </w:r>
-            <w:r>
-              <w:rPr>
-                <w:lang w:val="en-GB"/>
-              </w:rPr>
-              <w:t xml:space="preserve"> </w:t>
-            </w:r>
-            <w:r>
-              <w:rPr>
-                <w:lang w:val="en-GB"/>
-              </w:rPr>
-              <w:tab/>
-            </w:r>
-            <w:r>
-              <w:rPr>
-                <w:lang w:val="en-GB"/>
-              </w:rPr>
-              <w:tab/>
-            </w:r>
-            <w:r>
-              <w:rPr>
-                <w:lang w:val="en-GB"/>
-              </w:rPr>
-              <w:tab/>
             </w:r>
           </w:p>
         </w:tc>
         <w:tc>
           <w:tcPr>
-            <w:tcW w:w="4461" w:type="dxa"/>
+            <w:tcW w:w="4394" w:type="dxa"/>
+            <w:gridSpan w:val="2"/>
           </w:tcPr>
           <w:p>
             <w:pPr>
               <w:spacing w:before="60"/>
               <w:jc w:val="center"/>
               <w:rPr>
-                <w:i/>
                 <w:lang w:val="en-GB"/>
               </w:rPr>
             </w:pPr>
@@ -2483,25 +2407,7 @@
               <w:rPr>
                 <w:lang w:val="en-GB"/>
               </w:rPr>
-              <w:t xml:space="preserve">Dependent on transmitter class </w:t>
-            </w:r>
-            <w:r>
-              <w:rPr>
-                <w:lang w:val="en-GB"/>
-              </w:rPr>
-              <w:t>(</w:t>
-            </w:r>
-            <w:r>
-              <w:rPr>
-                <w:lang w:val="en-GB"/>
-              </w:rPr>
-              <w:t>see</w:t>
-            </w:r>
-            <w:r>
-              <w:rPr>
-                <w:lang w:val="en-GB"/>
-              </w:rPr>
-              <w:t xml:space="preserve"> 6.2)</w:t>
+              <w:t>Dependent on transmitter class (see 6.2)</w:t>
             </w:r>
           </w:p>
         </w:tc>
@@ -2509,7 +2415,7 @@
       <w:tr>
         <w:tc>
           <w:tcPr>
-            <w:tcW w:w="4606" w:type="dxa"/>
+            <w:tcW w:w="5240" w:type="dxa"/>
           </w:tcPr>
           <w:p>
             <w:pPr>
@@ -2530,38 +2436,27 @@
               <w:rPr>
                 <w:lang w:val="en-GB"/>
               </w:rPr>
+              <w:t xml:space="preserve"> Minimum receiver in-band</w:t>
+            </w:r>
+            <w:r>
+              <w:rPr>
+                <w:i/>
+                <w:lang w:val="en-GB"/>
+              </w:rPr>
               <w:t xml:space="preserve"> </w:t>
             </w:r>
             <w:r>
               <w:rPr>
                 <w:lang w:val="en-GB"/>
               </w:rPr>
-              <w:t>Minimum receiver in-band</w:t>
-            </w:r>
-            <w:r>
-              <w:rPr>
-                <w:i/>
-                <w:lang w:val="en-GB"/>
-              </w:rPr>
-              <w:t xml:space="preserve"> </w:t>
-            </w:r>
-            <w:r>
-              <w:rPr>
-                <w:lang w:val="en-GB"/>
-              </w:rPr>
-              <w:t>(RX2)</w:t>
-            </w:r>
-            <w:r>
-              <w:rPr>
-                <w:lang w:val="en-GB"/>
-              </w:rPr>
-              <w:t xml:space="preserve"> radiated power</w:t>
+              <w:t>(RX2) radiated power</w:t>
             </w:r>
           </w:p>
         </w:tc>
         <w:tc>
           <w:tcPr>
-            <w:tcW w:w="4461" w:type="dxa"/>
+            <w:tcW w:w="4394" w:type="dxa"/>
+            <w:gridSpan w:val="2"/>
           </w:tcPr>
           <w:p>
             <w:pPr>
@@ -2589,7 +2484,7 @@
       <w:tr>
         <w:tc>
           <w:tcPr>
-            <w:tcW w:w="4606" w:type="dxa"/>
+            <w:tcW w:w="5240" w:type="dxa"/>
           </w:tcPr>
           <w:p>
             <w:pPr>
@@ -2610,19 +2505,18 @@
               <w:rPr>
                 <w:lang w:val="en-GB"/>
               </w:rPr>
-              <w:t xml:space="preserve">Radiated power below pass band            </w:t>
+              <w:t>Radiated power below pass band</w:t>
             </w:r>
           </w:p>
         </w:tc>
         <w:tc>
           <w:tcPr>
-            <w:tcW w:w="4461" w:type="dxa"/>
+            <w:tcW w:w="2126" w:type="dxa"/>
           </w:tcPr>
           <w:p>
             <w:pPr>
               <w:spacing w:before="60"/>
               <w:rPr>
-                <w:i/>
                 <w:lang w:val="en-GB"/>
               </w:rPr>
             </w:pPr>
@@ -2630,7 +2524,26 @@
               <w:rPr>
                 <w:lang w:val="en-GB"/>
               </w:rPr>
-              <w:t xml:space="preserve">not specified               &lt; 10 % of </w:t>
+              <w:t>not specified</w:t>
+            </w:r>
+          </w:p>
+        </w:tc>
+        <w:tc>
+          <w:tcPr>
+            <w:tcW w:w="2268" w:type="dxa"/>
+          </w:tcPr>
+          <w:p>
+            <w:pPr>
+              <w:spacing w:before="60"/>
+              <w:rPr>
+                <w:lang w:val="en-GB"/>
+              </w:rPr>
+            </w:pPr>
+            <w:r>
+              <w:rPr>
+                <w:lang w:val="en-GB"/>
+              </w:rPr>
+              <w:t xml:space="preserve">&lt; 10 % of </w:t>
             </w:r>
             <w:r>
               <w:rPr>
@@ -2645,7 +2558,7 @@
       <w:tr>
         <w:tc>
           <w:tcPr>
-            <w:tcW w:w="4606" w:type="dxa"/>
+            <w:tcW w:w="5240" w:type="dxa"/>
           </w:tcPr>
           <w:p>
             <w:pPr>
@@ -2665,19 +2578,18 @@
               <w:rPr>
                 <w:lang w:val="en-GB"/>
               </w:rPr>
-              <w:t xml:space="preserve">Radiated power above pass band             </w:t>
+              <w:t xml:space="preserve">Radiated power above pass band </w:t>
             </w:r>
           </w:p>
         </w:tc>
         <w:tc>
           <w:tcPr>
-            <w:tcW w:w="4461" w:type="dxa"/>
+            <w:tcW w:w="2126" w:type="dxa"/>
           </w:tcPr>
           <w:p>
             <w:pPr>
               <w:spacing w:before="60"/>
               <w:rPr>
-                <w:i/>
                 <w:lang w:val="en-GB"/>
               </w:rPr>
             </w:pPr>
@@ -2692,8 +2604,21 @@
                 <w:i/>
                 <w:lang w:val="en-GB"/>
               </w:rPr>
-              <w:t xml:space="preserve">TX4                  </w:t>
+              <w:t>TX4</w:t>
             </w:r>
+          </w:p>
+        </w:tc>
+        <w:tc>
+          <w:tcPr>
+            <w:tcW w:w="2268" w:type="dxa"/>
+          </w:tcPr>
+          <w:p>
+            <w:pPr>
+              <w:spacing w:before="60"/>
+              <w:rPr>
+                <w:lang w:val="en-GB"/>
+              </w:rPr>
+            </w:pPr>
             <w:r>
               <w:rPr>
                 <w:lang w:val="en-GB"/>
@@ -2703,6 +2628,7 @@
           </w:p>
         </w:tc>
       </w:tr>
+      <w:bookmarkEnd w:id="7"/>
     </w:tbl>
     <w:p>
       <w:pPr>
@@ -2931,8 +2857,8 @@
           <w:lang w:val="en-GB"/>
         </w:rPr>
       </w:pPr>
-      <w:bookmarkStart w:id="7" w:name="_heading=h.3rdcrjn" w:colFirst="0" w:colLast="0"/>
-      <w:bookmarkEnd w:id="7"/>
+      <w:bookmarkStart w:id="8" w:name="_heading=h.3rdcrjn" w:colFirst="0" w:colLast="0"/>
+      <w:bookmarkEnd w:id="8"/>
       <w:r>
         <w:rPr>
           <w:b/>
@@ -3122,26 +3048,6 @@
           <w:lang w:val="en-GB"/>
         </w:rPr>
       </w:pPr>
-    </w:p>
-    <w:p>
-      <w:pPr>
-        <w:pBdr>
-          <w:top w:val="nil"/>
-          <w:left w:val="nil"/>
-          <w:bottom w:val="nil"/>
-          <w:right w:val="nil"/>
-          <w:between w:val="nil"/>
-        </w:pBdr>
-        <w:spacing w:after="200"/>
-        <w:jc w:val="center"/>
-        <w:rPr>
-          <w:b/>
-          <w:color w:val="auto"/>
-          <w:lang w:val="en-GB"/>
-        </w:rPr>
-      </w:pPr>
-      <w:bookmarkStart w:id="8" w:name="_heading=h.26in1rg" w:colFirst="0" w:colLast="0"/>
-      <w:bookmarkEnd w:id="8"/>
       <w:r>
         <w:rPr>
           <w:b/>
@@ -3150,16 +3056,16 @@
           <w:lang w:val="cs-CZ" w:eastAsia="cs-CZ"/>
         </w:rPr>
         <w:drawing>
-          <wp:anchor distT="0" distB="0" distL="114300" distR="114300" simplePos="0" relativeHeight="251658240" behindDoc="0" locked="0" layoutInCell="1" hidden="0" allowOverlap="1" wp14:anchorId="4D24FC97" wp14:editId="4EDDE6F3">
+          <wp:anchor distT="0" distB="0" distL="114300" distR="114300" simplePos="0" relativeHeight="251659264" behindDoc="0" locked="0" layoutInCell="1" hidden="0" allowOverlap="1" wp14:anchorId="07C41C20" wp14:editId="30B39CF8">
             <wp:simplePos x="0" y="0"/>
             <wp:positionH relativeFrom="column">
-              <wp:posOffset>1129665</wp:posOffset>
+              <wp:align>center</wp:align>
             </wp:positionH>
             <wp:positionV relativeFrom="paragraph">
-              <wp:posOffset>423545</wp:posOffset>
+              <wp:posOffset>168910</wp:posOffset>
             </wp:positionV>
-            <wp:extent cx="3938905" cy="3285490"/>
-            <wp:effectExtent l="0" t="0" r="4445" b="0"/>
+            <wp:extent cx="3938400" cy="3286800"/>
+            <wp:effectExtent l="0" t="0" r="0" b="2540"/>
             <wp:wrapTopAndBottom distT="0" distB="0"/>
             <wp:docPr id="1524725778" name="image1.png" descr="Obsah obrázku diagram, kresba, řada/pruh, skica&#10;&#10;Popis byl vytvořen automaticky"/>
             <wp:cNvGraphicFramePr/>
@@ -3180,7 +3086,7 @@
                   <pic:spPr>
                     <a:xfrm>
                       <a:off x="0" y="0"/>
-                      <a:ext cx="3938905" cy="3285490"/>
+                      <a:ext cx="3938400" cy="3286800"/>
                     </a:xfrm>
                     <a:prstGeom prst="rect">
                       <a:avLst/>
@@ -3199,546 +3105,6 @@
           </wp:anchor>
         </w:drawing>
       </w:r>
-      <w:r>
-        <w:rPr>
-          <w:b/>
-          <w:color w:val="auto"/>
-          <w:lang w:val="en-GB"/>
-        </w:rPr>
-        <w:t>Figure 1</w:t>
-      </w:r>
-      <w:r>
-        <w:rPr>
-          <w:b/>
-          <w:color w:val="auto"/>
-          <w:lang w:val="en-GB"/>
-        </w:rPr>
-        <w:t xml:space="preserve"> </w:t>
-      </w:r>
-      <w:r>
-        <w:rPr>
-          <w:b/>
-          <w:color w:val="auto"/>
-          <w:lang w:val="en-GB"/>
-        </w:rPr>
-        <w:t>– Horizontal opening and vertical opening angles in IR communication</w:t>
-      </w:r>
-      <w:r>
-        <w:rPr>
-          <w:b/>
-          <w:color w:val="auto"/>
-          <w:lang w:val="en-GB"/>
-        </w:rPr>
-        <w:t xml:space="preserve"> </w:t>
-      </w:r>
-      <w:r>
-        <w:rPr>
-          <w:b/>
-          <w:color w:val="auto"/>
-          <w:lang w:val="en-GB"/>
-        </w:rPr>
-        <w:br/>
-        <w:t>(Fig. 5 of the source standard)</w:t>
-      </w:r>
-    </w:p>
-    <w:p>
-      <w:pPr>
-        <w:pStyle w:val="Heading1"/>
-      </w:pPr>
-      <w:r>
-        <w:t>9</w:t>
-      </w:r>
-      <w:r>
-        <w:t> </w:t>
-      </w:r>
-      <w:r>
-        <w:t>Frames and Windows</w:t>
-      </w:r>
-    </w:p>
-    <w:p>
-      <w:pPr>
-        <w:pBdr>
-          <w:top w:val="none" w:sz="4" w:space="0" w:color="000000"/>
-          <w:left w:val="none" w:sz="4" w:space="0" w:color="000000"/>
-          <w:bottom w:val="none" w:sz="4" w:space="0" w:color="000000"/>
-          <w:right w:val="none" w:sz="4" w:space="0" w:color="000000"/>
-        </w:pBdr>
-        <w:spacing w:after="0" w:line="276" w:lineRule="auto"/>
-        <w:jc w:val="both"/>
-        <w:rPr>
-          <w:lang w:val="en-GB"/>
-        </w:rPr>
-      </w:pPr>
-      <w:r>
-        <w:rPr>
-          <w:lang w:val="en-GB"/>
-        </w:rPr>
-        <w:t xml:space="preserve">This </w:t>
-      </w:r>
-      <w:r>
-        <w:rPr>
-          <w:lang w:val="en-GB"/>
-        </w:rPr>
-        <w:t>clause</w:t>
-      </w:r>
-      <w:r>
-        <w:rPr>
-          <w:lang w:val="en-GB"/>
-        </w:rPr>
-        <w:t xml:space="preserve">, spanning 20 pages, describes the general structure of communication frames in IR communication. It also defines the communication diagram for simultaneous communication of multiple IR units. Data frames are separated by a special frame structure, also described in this </w:t>
-      </w:r>
-      <w:r>
-        <w:rPr>
-          <w:lang w:val="en-GB"/>
-        </w:rPr>
-        <w:t>clause</w:t>
-      </w:r>
-      <w:r>
-        <w:rPr>
-          <w:lang w:val="en-GB"/>
-        </w:rPr>
-        <w:t xml:space="preserve">. Frames are divided into communication windows, which are also defined in this </w:t>
-      </w:r>
-      <w:r>
-        <w:rPr>
-          <w:lang w:val="en-GB"/>
-        </w:rPr>
-        <w:t>clause</w:t>
-      </w:r>
-      <w:r>
-        <w:rPr>
-          <w:lang w:val="en-GB"/>
-        </w:rPr>
-        <w:t xml:space="preserve"> (management window, private window, multicast window, broadcast window, compatibility window, spare window, wake-up window).</w:t>
-      </w:r>
-    </w:p>
-    <w:p>
-      <w:pPr>
-        <w:pStyle w:val="Heading1"/>
-      </w:pPr>
-      <w:r>
-        <w:lastRenderedPageBreak/>
-        <w:t>10</w:t>
-      </w:r>
-      <w:r>
-        <w:t> </w:t>
-      </w:r>
-      <w:r>
-        <w:t>MAC</w:t>
-      </w:r>
-      <w:r>
-        <w:t xml:space="preserve"> Commands</w:t>
-      </w:r>
-    </w:p>
-    <w:p>
-      <w:pPr>
-        <w:pBdr>
-          <w:top w:val="none" w:sz="4" w:space="0" w:color="000000"/>
-          <w:left w:val="none" w:sz="4" w:space="0" w:color="000000"/>
-          <w:bottom w:val="none" w:sz="4" w:space="0" w:color="000000"/>
-          <w:right w:val="none" w:sz="4" w:space="0" w:color="000000"/>
-        </w:pBdr>
-        <w:spacing w:after="0" w:line="276" w:lineRule="auto"/>
-        <w:jc w:val="both"/>
-        <w:rPr>
-          <w:lang w:val="en-GB"/>
-        </w:rPr>
-      </w:pPr>
-      <w:r>
-        <w:rPr>
-          <w:lang w:val="en-GB"/>
-        </w:rPr>
-        <w:t xml:space="preserve">This </w:t>
-      </w:r>
-      <w:r>
-        <w:rPr>
-          <w:lang w:val="en-GB"/>
-        </w:rPr>
-        <w:t>clause</w:t>
-      </w:r>
-      <w:r>
-        <w:rPr>
-          <w:lang w:val="en-GB"/>
-        </w:rPr>
-        <w:t>, spanning 35 pages, describes the commands at the data link layer of the OSI model, which are used to signal interface activity between MAC communication participants. The respective sub</w:t>
-      </w:r>
-      <w:r>
-        <w:rPr>
-          <w:lang w:val="en-GB"/>
-        </w:rPr>
-        <w:t>clause</w:t>
-      </w:r>
-      <w:r>
-        <w:rPr>
-          <w:lang w:val="en-GB"/>
-        </w:rPr>
-        <w:t>s describe this signalling</w:t>
-      </w:r>
-      <w:r>
-        <w:rPr>
-          <w:lang w:val="en-GB"/>
-        </w:rPr>
-        <w:t>,</w:t>
-      </w:r>
-      <w:r>
-        <w:rPr>
-          <w:lang w:val="en-GB"/>
-        </w:rPr>
-        <w:t xml:space="preserve"> based on the requirements of different control units of the ITS station (specifically the IR-CAL communication adaptation layer, the IR-MAE management adaptation entity, and the IR-ME management entity). The </w:t>
-      </w:r>
-      <w:r>
-        <w:rPr>
-          <w:lang w:val="en-GB"/>
-        </w:rPr>
-        <w:t>clause</w:t>
-      </w:r>
-      <w:r>
-        <w:rPr>
-          <w:lang w:val="en-GB"/>
-        </w:rPr>
-        <w:t xml:space="preserve"> also details individual MAC commands</w:t>
-      </w:r>
-      <w:r>
-        <w:rPr>
-          <w:lang w:val="en-GB"/>
-        </w:rPr>
-        <w:t>,</w:t>
-      </w:r>
-      <w:r>
-        <w:rPr>
-          <w:lang w:val="en-GB"/>
-        </w:rPr>
-        <w:t xml:space="preserve"> in text and in parameter tables.</w:t>
-      </w:r>
-    </w:p>
-    <w:p>
-      <w:pPr>
-        <w:pStyle w:val="Heading1"/>
-      </w:pPr>
-      <w:r>
-        <w:t>11</w:t>
-      </w:r>
-      <w:r>
-        <w:t> </w:t>
-      </w:r>
-      <w:r>
-        <w:t>Registration Procedure</w:t>
-      </w:r>
-    </w:p>
-    <w:p>
-      <w:pPr>
-        <w:pBdr>
-          <w:top w:val="none" w:sz="4" w:space="0" w:color="000000"/>
-          <w:left w:val="none" w:sz="4" w:space="0" w:color="000000"/>
-          <w:bottom w:val="none" w:sz="4" w:space="0" w:color="000000"/>
-          <w:right w:val="none" w:sz="4" w:space="0" w:color="000000"/>
-        </w:pBdr>
-        <w:spacing w:after="0" w:line="276" w:lineRule="auto"/>
-        <w:jc w:val="both"/>
-        <w:rPr>
-          <w:lang w:val="en-GB"/>
-        </w:rPr>
-      </w:pPr>
-      <w:r>
-        <w:rPr>
-          <w:lang w:val="en-GB"/>
-        </w:rPr>
-        <w:t xml:space="preserve">This </w:t>
-      </w:r>
-      <w:r>
-        <w:rPr>
-          <w:lang w:val="en-GB"/>
-        </w:rPr>
-        <w:t>clause</w:t>
-      </w:r>
-      <w:r>
-        <w:rPr>
-          <w:lang w:val="en-GB"/>
-        </w:rPr>
-        <w:t>, spanning 4 pages, describes</w:t>
-      </w:r>
-      <w:r>
-        <w:rPr>
-          <w:lang w:val="en-GB"/>
-        </w:rPr>
-        <w:t>,</w:t>
-      </w:r>
-      <w:r>
-        <w:rPr>
-          <w:lang w:val="en-GB"/>
-        </w:rPr>
-        <w:t xml:space="preserve"> in text, tables, and diagrams</w:t>
-      </w:r>
-      <w:r>
-        <w:rPr>
-          <w:lang w:val="en-GB"/>
-        </w:rPr>
-        <w:t>,</w:t>
-      </w:r>
-      <w:r>
-        <w:rPr>
-          <w:lang w:val="en-GB"/>
-        </w:rPr>
-        <w:t xml:space="preserve"> the registration procedure used to register the IR interface into communication.</w:t>
-      </w:r>
-    </w:p>
-    <w:p>
-      <w:pPr>
-        <w:pStyle w:val="Heading1"/>
-      </w:pPr>
-      <w:r>
-        <w:t>1</w:t>
-      </w:r>
-      <w:r>
-        <w:t>2</w:t>
-      </w:r>
-      <w:r>
-        <w:t> </w:t>
-      </w:r>
-      <w:r>
-        <w:t>Window Management</w:t>
-      </w:r>
-    </w:p>
-    <w:p>
-      <w:pPr>
-        <w:pBdr>
-          <w:top w:val="none" w:sz="4" w:space="0" w:color="000000"/>
-          <w:left w:val="none" w:sz="4" w:space="0" w:color="000000"/>
-          <w:bottom w:val="none" w:sz="4" w:space="0" w:color="000000"/>
-          <w:right w:val="none" w:sz="4" w:space="0" w:color="000000"/>
-        </w:pBdr>
-        <w:spacing w:after="0" w:line="276" w:lineRule="auto"/>
-        <w:jc w:val="both"/>
-        <w:rPr>
-          <w:b/>
-          <w:sz w:val="24"/>
-          <w:szCs w:val="24"/>
-          <w:lang w:val="en-GB"/>
-        </w:rPr>
-      </w:pPr>
-      <w:r>
-        <w:rPr>
-          <w:lang w:val="en-GB"/>
-        </w:rPr>
-        <w:t xml:space="preserve">This </w:t>
-      </w:r>
-      <w:r>
-        <w:rPr>
-          <w:lang w:val="en-GB"/>
-        </w:rPr>
-        <w:t>clause</w:t>
-      </w:r>
-      <w:r>
-        <w:rPr>
-          <w:lang w:val="en-GB"/>
-        </w:rPr>
-        <w:t>, spanning 2 pages, describes</w:t>
-      </w:r>
-      <w:r>
-        <w:rPr>
-          <w:lang w:val="en-GB"/>
-        </w:rPr>
-        <w:t>,</w:t>
-      </w:r>
-      <w:r>
-        <w:rPr>
-          <w:lang w:val="en-GB"/>
-        </w:rPr>
-        <w:t xml:space="preserve"> in text</w:t>
-      </w:r>
-      <w:r>
-        <w:rPr>
-          <w:lang w:val="en-GB"/>
-        </w:rPr>
-        <w:t>,</w:t>
-      </w:r>
-      <w:r>
-        <w:rPr>
-          <w:lang w:val="en-GB"/>
-        </w:rPr>
-        <w:t xml:space="preserve"> the mechanism for </w:t>
-      </w:r>
-      <w:r>
-        <w:rPr>
-          <w:lang w:val="en-GB"/>
-        </w:rPr>
-        <w:t>managing</w:t>
-      </w:r>
-      <w:r>
-        <w:rPr>
-          <w:lang w:val="en-GB"/>
-        </w:rPr>
-        <w:t xml:space="preserve"> communication windows within IR communication. This </w:t>
-      </w:r>
-      <w:r>
-        <w:rPr>
-          <w:lang w:val="en-GB"/>
-        </w:rPr>
-        <w:t xml:space="preserve">especially </w:t>
-      </w:r>
-      <w:r>
-        <w:rPr>
-          <w:lang w:val="en-GB"/>
-        </w:rPr>
-        <w:t>includes allocating sufficient communication time for individual IR interfaces in communication, managing communication windows for time-critical applications, controlling the required IR interface response time, and more.</w:t>
-      </w:r>
-    </w:p>
-    <w:p>
-      <w:pPr>
-        <w:pStyle w:val="Heading1"/>
-      </w:pPr>
-      <w:r>
-        <w:t>1</w:t>
-      </w:r>
-      <w:r>
-        <w:t>3</w:t>
-      </w:r>
-      <w:r>
-        <w:t> </w:t>
-      </w:r>
-      <w:r>
-        <w:t>IR</w:t>
-      </w:r>
-      <w:r>
-        <w:t xml:space="preserve"> Management Entity</w:t>
-      </w:r>
-    </w:p>
-    <w:p>
-      <w:pPr>
-        <w:pBdr>
-          <w:top w:val="none" w:sz="4" w:space="0" w:color="000000"/>
-          <w:left w:val="none" w:sz="4" w:space="0" w:color="000000"/>
-          <w:bottom w:val="none" w:sz="4" w:space="0" w:color="000000"/>
-          <w:right w:val="none" w:sz="4" w:space="0" w:color="000000"/>
-        </w:pBdr>
-        <w:spacing w:after="0" w:line="276" w:lineRule="auto"/>
-        <w:jc w:val="both"/>
-        <w:rPr>
-          <w:lang w:val="en-GB"/>
-        </w:rPr>
-      </w:pPr>
-      <w:r>
-        <w:rPr>
-          <w:lang w:val="en-GB"/>
-        </w:rPr>
-        <w:t xml:space="preserve">This </w:t>
-      </w:r>
-      <w:r>
-        <w:rPr>
-          <w:lang w:val="en-GB"/>
-        </w:rPr>
-        <w:t>clause</w:t>
-      </w:r>
-      <w:r>
-        <w:rPr>
-          <w:lang w:val="en-GB"/>
-        </w:rPr>
-        <w:t>, spanning 4 pages, describes</w:t>
-      </w:r>
-      <w:r>
-        <w:rPr>
-          <w:lang w:val="en-GB"/>
-        </w:rPr>
-        <w:t>,</w:t>
-      </w:r>
-      <w:r>
-        <w:rPr>
-          <w:lang w:val="en-GB"/>
-        </w:rPr>
-        <w:t xml:space="preserve"> in text and tables</w:t>
-      </w:r>
-      <w:r>
-        <w:rPr>
-          <w:lang w:val="en-GB"/>
-        </w:rPr>
-        <w:t>,</w:t>
-      </w:r>
-      <w:r>
-        <w:rPr>
-          <w:lang w:val="en-GB"/>
-        </w:rPr>
-        <w:t xml:space="preserve"> the basic features of the IR interface management entity (IR-ME), which is responsible for managing the IR MAC layer and the IR physical layer of the OSI model. This unit also ensures connectivity with the higher layers of the ITS station.</w:t>
-      </w:r>
-    </w:p>
-    <w:p>
-      <w:pPr>
-        <w:pStyle w:val="Heading1"/>
-      </w:pPr>
-      <w:r>
-        <w:t>1</w:t>
-      </w:r>
-      <w:r>
-        <w:t>4</w:t>
-      </w:r>
-      <w:r>
-        <w:t> </w:t>
-      </w:r>
-      <w:r>
-        <w:t>Adapta</w:t>
-      </w:r>
-      <w:r>
-        <w:t>tion</w:t>
-      </w:r>
-    </w:p>
-    <w:p>
-      <w:pPr>
-        <w:pBdr>
-          <w:top w:val="none" w:sz="4" w:space="0" w:color="000000"/>
-          <w:left w:val="none" w:sz="4" w:space="0" w:color="000000"/>
-          <w:bottom w:val="none" w:sz="4" w:space="0" w:color="000000"/>
-          <w:right w:val="none" w:sz="4" w:space="0" w:color="000000"/>
-        </w:pBdr>
-        <w:spacing w:after="0" w:line="276" w:lineRule="auto"/>
-        <w:jc w:val="both"/>
-        <w:rPr>
-          <w:lang w:val="en-GB"/>
-        </w:rPr>
-      </w:pPr>
-      <w:r>
-        <w:rPr>
-          <w:lang w:val="en-GB"/>
-        </w:rPr>
-        <w:t xml:space="preserve">This </w:t>
-      </w:r>
-      <w:r>
-        <w:rPr>
-          <w:lang w:val="en-GB"/>
-        </w:rPr>
-        <w:t>clause</w:t>
-      </w:r>
-      <w:r>
-        <w:rPr>
-          <w:lang w:val="en-GB"/>
-        </w:rPr>
-        <w:t>, spanning 6 pages, describes in text, diagrams, and tables</w:t>
-      </w:r>
-      <w:r>
-        <w:rPr>
-          <w:lang w:val="en-GB"/>
-        </w:rPr>
-        <w:t>,</w:t>
-      </w:r>
-      <w:r>
-        <w:rPr>
-          <w:lang w:val="en-GB"/>
-        </w:rPr>
-        <w:t xml:space="preserve"> how to integrate the IR interface into the structure of the ITS station. The adaptation structure of the IR interface into the ITS station is shown in Figure 2.</w:t>
-      </w:r>
-    </w:p>
-    <w:p>
-      <w:pPr>
-        <w:pBdr>
-          <w:top w:val="none" w:sz="4" w:space="0" w:color="000000"/>
-          <w:left w:val="none" w:sz="4" w:space="0" w:color="000000"/>
-          <w:bottom w:val="none" w:sz="4" w:space="0" w:color="000000"/>
-          <w:right w:val="none" w:sz="4" w:space="0" w:color="000000"/>
-        </w:pBdr>
-        <w:spacing w:after="0" w:line="276" w:lineRule="auto"/>
-        <w:jc w:val="both"/>
-        <w:rPr>
-          <w:lang w:val="en-GB"/>
-        </w:rPr>
-      </w:pPr>
     </w:p>
     <w:p>
       <w:pPr>
@@ -3757,13 +3123,15 @@
           <w:lang w:val="en-GB"/>
         </w:rPr>
       </w:pPr>
+      <w:bookmarkStart w:id="9" w:name="_heading=h.26in1rg" w:colFirst="0" w:colLast="0"/>
+      <w:bookmarkEnd w:id="9"/>
       <w:r>
         <w:rPr>
           <w:b/>
           <w:color w:val="auto"/>
           <w:lang w:val="en-GB"/>
         </w:rPr>
-        <w:t>Figure 2</w:t>
+        <w:t>Figure 1</w:t>
       </w:r>
       <w:r>
         <w:rPr>
@@ -3779,7 +3147,7 @@
           <w:color w:val="auto"/>
           <w:lang w:val="en-GB"/>
         </w:rPr>
-        <w:t>– Medium adaptation of the IR interface into the ITS station</w:t>
+        <w:t>– Horizontal opening and vertical opening angles in IR communication</w:t>
       </w:r>
       <w:r>
         <w:rPr>
@@ -3787,8 +3155,516 @@
           <w:color w:val="auto"/>
           <w:lang w:val="en-GB"/>
         </w:rPr>
-        <w:t xml:space="preserve"> (Fig. 17 of the source standard)</w:t>
-      </w:r>
+        <w:t xml:space="preserve"> </w:t>
+      </w:r>
+      <w:r>
+        <w:rPr>
+          <w:b/>
+          <w:color w:val="auto"/>
+          <w:lang w:val="en-GB"/>
+        </w:rPr>
+        <w:br/>
+        <w:t>(Fig. 5 of the source standard)</w:t>
+      </w:r>
+    </w:p>
+    <w:p>
+      <w:pPr>
+        <w:pStyle w:val="Heading1"/>
+      </w:pPr>
+      <w:r>
+        <w:t>9</w:t>
+      </w:r>
+      <w:r>
+        <w:t> </w:t>
+      </w:r>
+      <w:r>
+        <w:t>Frames and Windows</w:t>
+      </w:r>
+    </w:p>
+    <w:p>
+      <w:pPr>
+        <w:pBdr>
+          <w:top w:val="none" w:sz="4" w:space="0" w:color="000000"/>
+          <w:left w:val="none" w:sz="4" w:space="0" w:color="000000"/>
+          <w:bottom w:val="none" w:sz="4" w:space="0" w:color="000000"/>
+          <w:right w:val="none" w:sz="4" w:space="0" w:color="000000"/>
+        </w:pBdr>
+        <w:spacing w:after="0" w:line="276" w:lineRule="auto"/>
+        <w:jc w:val="both"/>
+        <w:rPr>
+          <w:lang w:val="en-GB"/>
+        </w:rPr>
+      </w:pPr>
+      <w:r>
+        <w:rPr>
+          <w:lang w:val="en-GB"/>
+        </w:rPr>
+        <w:t xml:space="preserve">This </w:t>
+      </w:r>
+      <w:r>
+        <w:rPr>
+          <w:lang w:val="en-GB"/>
+        </w:rPr>
+        <w:t>clause</w:t>
+      </w:r>
+      <w:r>
+        <w:rPr>
+          <w:lang w:val="en-GB"/>
+        </w:rPr>
+        <w:t xml:space="preserve">, spanning 20 pages, describes the general structure of communication frames in IR communication. It also defines the communication diagram for simultaneous communication of multiple IR units. Data frames are separated by a special frame structure, also described in this </w:t>
+      </w:r>
+      <w:r>
+        <w:rPr>
+          <w:lang w:val="en-GB"/>
+        </w:rPr>
+        <w:t>clause</w:t>
+      </w:r>
+      <w:r>
+        <w:rPr>
+          <w:lang w:val="en-GB"/>
+        </w:rPr>
+        <w:t xml:space="preserve">. Frames are divided into communication windows, which are also defined in this </w:t>
+      </w:r>
+      <w:r>
+        <w:rPr>
+          <w:lang w:val="en-GB"/>
+        </w:rPr>
+        <w:t>clause</w:t>
+      </w:r>
+      <w:r>
+        <w:rPr>
+          <w:lang w:val="en-GB"/>
+        </w:rPr>
+        <w:t xml:space="preserve"> (management window, private window, multicast window, broadcast window, compatibility window, spare window, wake-up window).</w:t>
+      </w:r>
+    </w:p>
+    <w:p>
+      <w:pPr>
+        <w:pStyle w:val="Heading1"/>
+      </w:pPr>
+      <w:r>
+        <w:lastRenderedPageBreak/>
+        <w:t>10</w:t>
+      </w:r>
+      <w:r>
+        <w:t> </w:t>
+      </w:r>
+      <w:r>
+        <w:t>MAC</w:t>
+      </w:r>
+      <w:r>
+        <w:t xml:space="preserve"> Commands</w:t>
+      </w:r>
+    </w:p>
+    <w:p>
+      <w:pPr>
+        <w:pBdr>
+          <w:top w:val="none" w:sz="4" w:space="0" w:color="000000"/>
+          <w:left w:val="none" w:sz="4" w:space="0" w:color="000000"/>
+          <w:bottom w:val="none" w:sz="4" w:space="0" w:color="000000"/>
+          <w:right w:val="none" w:sz="4" w:space="0" w:color="000000"/>
+        </w:pBdr>
+        <w:spacing w:after="0" w:line="276" w:lineRule="auto"/>
+        <w:jc w:val="both"/>
+        <w:rPr>
+          <w:lang w:val="en-GB"/>
+        </w:rPr>
+      </w:pPr>
+      <w:r>
+        <w:rPr>
+          <w:lang w:val="en-GB"/>
+        </w:rPr>
+        <w:t xml:space="preserve">This </w:t>
+      </w:r>
+      <w:r>
+        <w:rPr>
+          <w:lang w:val="en-GB"/>
+        </w:rPr>
+        <w:t>clause</w:t>
+      </w:r>
+      <w:r>
+        <w:rPr>
+          <w:lang w:val="en-GB"/>
+        </w:rPr>
+        <w:t>, spanning 35 pages, describes the commands at the data link layer of the OSI model, which are used to signal interface activity between MAC communication participants. The respective sub</w:t>
+      </w:r>
+      <w:r>
+        <w:rPr>
+          <w:lang w:val="en-GB"/>
+        </w:rPr>
+        <w:t>clause</w:t>
+      </w:r>
+      <w:r>
+        <w:rPr>
+          <w:lang w:val="en-GB"/>
+        </w:rPr>
+        <w:t>s describe this signalling</w:t>
+      </w:r>
+      <w:r>
+        <w:rPr>
+          <w:lang w:val="en-GB"/>
+        </w:rPr>
+        <w:t>,</w:t>
+      </w:r>
+      <w:r>
+        <w:rPr>
+          <w:lang w:val="en-GB"/>
+        </w:rPr>
+        <w:t xml:space="preserve"> based on the requirements of different control units of the ITS station (specifically the IR-CAL communication adaptation layer, the IR-MAE management adaptation entity, and the IR-ME management entity). The </w:t>
+      </w:r>
+      <w:r>
+        <w:rPr>
+          <w:lang w:val="en-GB"/>
+        </w:rPr>
+        <w:t>clause</w:t>
+      </w:r>
+      <w:r>
+        <w:rPr>
+          <w:lang w:val="en-GB"/>
+        </w:rPr>
+        <w:t xml:space="preserve"> also details individual MAC commands</w:t>
+      </w:r>
+      <w:r>
+        <w:rPr>
+          <w:lang w:val="en-GB"/>
+        </w:rPr>
+        <w:t>,</w:t>
+      </w:r>
+      <w:r>
+        <w:rPr>
+          <w:lang w:val="en-GB"/>
+        </w:rPr>
+        <w:t xml:space="preserve"> in text and in parameter tables.</w:t>
+      </w:r>
+    </w:p>
+    <w:p>
+      <w:pPr>
+        <w:pStyle w:val="Heading1"/>
+      </w:pPr>
+      <w:r>
+        <w:t>11</w:t>
+      </w:r>
+      <w:r>
+        <w:t> </w:t>
+      </w:r>
+      <w:r>
+        <w:t>Registration Procedure</w:t>
+      </w:r>
+    </w:p>
+    <w:p>
+      <w:pPr>
+        <w:pBdr>
+          <w:top w:val="none" w:sz="4" w:space="0" w:color="000000"/>
+          <w:left w:val="none" w:sz="4" w:space="0" w:color="000000"/>
+          <w:bottom w:val="none" w:sz="4" w:space="0" w:color="000000"/>
+          <w:right w:val="none" w:sz="4" w:space="0" w:color="000000"/>
+        </w:pBdr>
+        <w:spacing w:after="0" w:line="276" w:lineRule="auto"/>
+        <w:jc w:val="both"/>
+        <w:rPr>
+          <w:lang w:val="en-GB"/>
+        </w:rPr>
+      </w:pPr>
+      <w:r>
+        <w:rPr>
+          <w:lang w:val="en-GB"/>
+        </w:rPr>
+        <w:t xml:space="preserve">This </w:t>
+      </w:r>
+      <w:r>
+        <w:rPr>
+          <w:lang w:val="en-GB"/>
+        </w:rPr>
+        <w:t>clause</w:t>
+      </w:r>
+      <w:r>
+        <w:rPr>
+          <w:lang w:val="en-GB"/>
+        </w:rPr>
+        <w:t>, spanning 4 pages, describes</w:t>
+      </w:r>
+      <w:r>
+        <w:rPr>
+          <w:lang w:val="en-GB"/>
+        </w:rPr>
+        <w:t>,</w:t>
+      </w:r>
+      <w:r>
+        <w:rPr>
+          <w:lang w:val="en-GB"/>
+        </w:rPr>
+        <w:t xml:space="preserve"> in text, tables, and diagrams</w:t>
+      </w:r>
+      <w:r>
+        <w:rPr>
+          <w:lang w:val="en-GB"/>
+        </w:rPr>
+        <w:t>,</w:t>
+      </w:r>
+      <w:r>
+        <w:rPr>
+          <w:lang w:val="en-GB"/>
+        </w:rPr>
+        <w:t xml:space="preserve"> the registration procedure used to register the IR interface into communication.</w:t>
+      </w:r>
+    </w:p>
+    <w:p>
+      <w:pPr>
+        <w:pStyle w:val="Heading1"/>
+      </w:pPr>
+      <w:r>
+        <w:t>1</w:t>
+      </w:r>
+      <w:r>
+        <w:t>2</w:t>
+      </w:r>
+      <w:r>
+        <w:t> </w:t>
+      </w:r>
+      <w:r>
+        <w:t>Window Management</w:t>
+      </w:r>
+    </w:p>
+    <w:p>
+      <w:pPr>
+        <w:pBdr>
+          <w:top w:val="none" w:sz="4" w:space="0" w:color="000000"/>
+          <w:left w:val="none" w:sz="4" w:space="0" w:color="000000"/>
+          <w:bottom w:val="none" w:sz="4" w:space="0" w:color="000000"/>
+          <w:right w:val="none" w:sz="4" w:space="0" w:color="000000"/>
+        </w:pBdr>
+        <w:spacing w:after="0" w:line="276" w:lineRule="auto"/>
+        <w:jc w:val="both"/>
+        <w:rPr>
+          <w:b/>
+          <w:sz w:val="24"/>
+          <w:szCs w:val="24"/>
+          <w:lang w:val="en-GB"/>
+        </w:rPr>
+      </w:pPr>
+      <w:r>
+        <w:rPr>
+          <w:lang w:val="en-GB"/>
+        </w:rPr>
+        <w:t xml:space="preserve">This </w:t>
+      </w:r>
+      <w:r>
+        <w:rPr>
+          <w:lang w:val="en-GB"/>
+        </w:rPr>
+        <w:t>clause</w:t>
+      </w:r>
+      <w:r>
+        <w:rPr>
+          <w:lang w:val="en-GB"/>
+        </w:rPr>
+        <w:t>, spanning 2 pages, describes</w:t>
+      </w:r>
+      <w:r>
+        <w:rPr>
+          <w:lang w:val="en-GB"/>
+        </w:rPr>
+        <w:t>,</w:t>
+      </w:r>
+      <w:r>
+        <w:rPr>
+          <w:lang w:val="en-GB"/>
+        </w:rPr>
+        <w:t xml:space="preserve"> in text</w:t>
+      </w:r>
+      <w:r>
+        <w:rPr>
+          <w:lang w:val="en-GB"/>
+        </w:rPr>
+        <w:t>,</w:t>
+      </w:r>
+      <w:r>
+        <w:rPr>
+          <w:lang w:val="en-GB"/>
+        </w:rPr>
+        <w:t xml:space="preserve"> the mechanism for </w:t>
+      </w:r>
+      <w:r>
+        <w:rPr>
+          <w:lang w:val="en-GB"/>
+        </w:rPr>
+        <w:t>managing</w:t>
+      </w:r>
+      <w:r>
+        <w:rPr>
+          <w:lang w:val="en-GB"/>
+        </w:rPr>
+        <w:t xml:space="preserve"> communication windows within IR communication. This </w:t>
+      </w:r>
+      <w:r>
+        <w:rPr>
+          <w:lang w:val="en-GB"/>
+        </w:rPr>
+        <w:t xml:space="preserve">especially </w:t>
+      </w:r>
+      <w:r>
+        <w:rPr>
+          <w:lang w:val="en-GB"/>
+        </w:rPr>
+        <w:t>includes allocating sufficient communication time for individual IR interfaces in communication, managing communication windows for time-critical applications, controlling the required IR interface response time, and more.</w:t>
+      </w:r>
+    </w:p>
+    <w:p>
+      <w:pPr>
+        <w:pStyle w:val="Heading1"/>
+      </w:pPr>
+      <w:r>
+        <w:t>1</w:t>
+      </w:r>
+      <w:r>
+        <w:t>3</w:t>
+      </w:r>
+      <w:r>
+        <w:t> </w:t>
+      </w:r>
+      <w:r>
+        <w:t>IR</w:t>
+      </w:r>
+      <w:r>
+        <w:t xml:space="preserve"> Management Entity</w:t>
+      </w:r>
+    </w:p>
+    <w:p>
+      <w:pPr>
+        <w:pBdr>
+          <w:top w:val="none" w:sz="4" w:space="0" w:color="000000"/>
+          <w:left w:val="none" w:sz="4" w:space="0" w:color="000000"/>
+          <w:bottom w:val="none" w:sz="4" w:space="0" w:color="000000"/>
+          <w:right w:val="none" w:sz="4" w:space="0" w:color="000000"/>
+        </w:pBdr>
+        <w:spacing w:after="0" w:line="276" w:lineRule="auto"/>
+        <w:jc w:val="both"/>
+        <w:rPr>
+          <w:lang w:val="en-GB"/>
+        </w:rPr>
+      </w:pPr>
+      <w:r>
+        <w:rPr>
+          <w:lang w:val="en-GB"/>
+        </w:rPr>
+        <w:t xml:space="preserve">This </w:t>
+      </w:r>
+      <w:r>
+        <w:rPr>
+          <w:lang w:val="en-GB"/>
+        </w:rPr>
+        <w:t>clause</w:t>
+      </w:r>
+      <w:r>
+        <w:rPr>
+          <w:lang w:val="en-GB"/>
+        </w:rPr>
+        <w:t>, spanning 4 pages, describes</w:t>
+      </w:r>
+      <w:r>
+        <w:rPr>
+          <w:lang w:val="en-GB"/>
+        </w:rPr>
+        <w:t>,</w:t>
+      </w:r>
+      <w:r>
+        <w:rPr>
+          <w:lang w:val="en-GB"/>
+        </w:rPr>
+        <w:t xml:space="preserve"> in text and tables</w:t>
+      </w:r>
+      <w:r>
+        <w:rPr>
+          <w:lang w:val="en-GB"/>
+        </w:rPr>
+        <w:t>,</w:t>
+      </w:r>
+      <w:r>
+        <w:rPr>
+          <w:lang w:val="en-GB"/>
+        </w:rPr>
+        <w:t xml:space="preserve"> the basic features of the IR interface management entity (IR-ME), which is responsible for managing the IR MAC layer and the IR physical layer of the OSI model. This unit also ensures connectivity with the higher layers of the ITS station.</w:t>
+      </w:r>
+    </w:p>
+    <w:p>
+      <w:pPr>
+        <w:pStyle w:val="Heading1"/>
+      </w:pPr>
+      <w:r>
+        <w:t>1</w:t>
+      </w:r>
+      <w:r>
+        <w:t>4</w:t>
+      </w:r>
+      <w:r>
+        <w:t> </w:t>
+      </w:r>
+      <w:r>
+        <w:t>Adapta</w:t>
+      </w:r>
+      <w:r>
+        <w:t>tion</w:t>
+      </w:r>
+    </w:p>
+    <w:p>
+      <w:pPr>
+        <w:pBdr>
+          <w:top w:val="none" w:sz="4" w:space="0" w:color="000000"/>
+          <w:left w:val="none" w:sz="4" w:space="0" w:color="000000"/>
+          <w:bottom w:val="none" w:sz="4" w:space="0" w:color="000000"/>
+          <w:right w:val="none" w:sz="4" w:space="0" w:color="000000"/>
+        </w:pBdr>
+        <w:spacing w:after="0" w:line="276" w:lineRule="auto"/>
+        <w:jc w:val="both"/>
+        <w:rPr>
+          <w:lang w:val="en-GB"/>
+        </w:rPr>
+      </w:pPr>
+      <w:r>
+        <w:rPr>
+          <w:lang w:val="en-GB"/>
+        </w:rPr>
+        <w:t xml:space="preserve">This </w:t>
+      </w:r>
+      <w:r>
+        <w:rPr>
+          <w:lang w:val="en-GB"/>
+        </w:rPr>
+        <w:t>clause</w:t>
+      </w:r>
+      <w:r>
+        <w:rPr>
+          <w:lang w:val="en-GB"/>
+        </w:rPr>
+        <w:t>, spanning 6 pages, describes in text, diagrams, and tables</w:t>
+      </w:r>
+      <w:r>
+        <w:rPr>
+          <w:lang w:val="en-GB"/>
+        </w:rPr>
+        <w:t>,</w:t>
+      </w:r>
+      <w:r>
+        <w:rPr>
+          <w:lang w:val="en-GB"/>
+        </w:rPr>
+        <w:t xml:space="preserve"> how to integrate the IR interface into the structure of the ITS station. The adaptation structure of the IR interface into the ITS station is shown in Figure 2.</w:t>
+      </w:r>
+    </w:p>
+    <w:p>
+      <w:pPr>
+        <w:pBdr>
+          <w:top w:val="none" w:sz="4" w:space="0" w:color="000000"/>
+          <w:left w:val="none" w:sz="4" w:space="0" w:color="000000"/>
+          <w:bottom w:val="none" w:sz="4" w:space="0" w:color="000000"/>
+          <w:right w:val="none" w:sz="4" w:space="0" w:color="000000"/>
+        </w:pBdr>
+        <w:spacing w:after="0" w:line="276" w:lineRule="auto"/>
+        <w:jc w:val="both"/>
+        <w:rPr>
+          <w:lang w:val="en-GB"/>
+        </w:rPr>
+      </w:pPr>
     </w:p>
     <w:p>
       <w:pPr>
@@ -3861,16 +3737,26 @@
         <w:spacing w:after="200"/>
         <w:jc w:val="center"/>
         <w:rPr>
-          <w:lang w:val="en-GB"/>
-        </w:rPr>
-      </w:pPr>
+          <w:b/>
+          <w:color w:val="auto"/>
+          <w:lang w:val="en-GB"/>
+        </w:rPr>
+      </w:pPr>
+      <w:r>
+        <w:rPr>
+          <w:b/>
+          <w:color w:val="auto"/>
+          <w:lang w:val="en-GB"/>
+        </w:rPr>
+        <w:t>Figure 2 – Medium adaptation of the IR interface into the ITS station (Fig. 17 of the source standard)</w:t>
+      </w:r>
     </w:p>
     <w:p>
       <w:pPr>
         <w:pStyle w:val="Heading1"/>
       </w:pPr>
-      <w:bookmarkStart w:id="9" w:name="_heading=h.lnxbz9" w:colFirst="0" w:colLast="0"/>
-      <w:bookmarkEnd w:id="9"/>
+      <w:bookmarkStart w:id="10" w:name="_heading=h.lnxbz9" w:colFirst="0" w:colLast="0"/>
+      <w:bookmarkEnd w:id="10"/>
       <w:r>
         <w:t>1</w:t>
       </w:r>
@@ -3940,7 +3826,6 @@
         <w:pStyle w:val="Heading1"/>
       </w:pPr>
       <w:r>
-        <w:lastRenderedPageBreak/>
         <w:t>1</w:t>
       </w:r>
       <w:r>
@@ -3991,6 +3876,7 @@
         <w:pStyle w:val="Heading1"/>
       </w:pPr>
       <w:r>
+        <w:lastRenderedPageBreak/>
         <w:t>1</w:t>
       </w:r>
       <w:r>

</xml_diff>